<commit_message>
update bm&&pbl design requirement v4
</commit_message>
<xml_diff>
--- a/claude/cr60_light_BYD_SingleFreqPoint_dp/BYD/Bootloader_BM_PBL_Supplier_High_Level_Design_WF.docx
+++ b/claude/cr60_light_BYD_SingleFreqPoint_dp/BYD/Bootloader_BM_PBL_Supplier_High_Level_Design_WF.docx
@@ -7864,46 +7864,22 @@
           <w:szCs w:val="21"/>
           <w:lang w:val="zh-CN"/>
         </w:rPr>
-        <w:t>服务矩阵、</w:t>
-      </w:r>
-      <w:r>
-        <w:rPr>
-          <w:szCs w:val="21"/>
-        </w:rPr>
-        <w:t>NRC</w:t>
-      </w:r>
-      <w:r>
-        <w:rPr>
-          <w:szCs w:val="21"/>
-          <w:lang w:val="zh-CN"/>
-        </w:rPr>
-        <w:t>、</w:t>
-      </w:r>
-      <w:r>
-        <w:rPr>
-          <w:szCs w:val="21"/>
-        </w:rPr>
-        <w:t xml:space="preserve">P2/P2*/S3 </w:t>
-      </w:r>
-      <w:r>
-        <w:rPr>
-          <w:szCs w:val="21"/>
-          <w:lang w:val="zh-CN"/>
-        </w:rPr>
-        <w:t>时序和</w:t>
-      </w:r>
-      <w:r>
-        <w:rPr>
-          <w:szCs w:val="21"/>
-        </w:rPr>
-        <w:t xml:space="preserve"> SecurityAccess </w:t>
-      </w:r>
-      <w:r>
-        <w:rPr>
-          <w:szCs w:val="21"/>
-          <w:lang w:val="zh-CN"/>
-        </w:rPr>
-        <w:t>算法。</w:t>
+        <w:t>服务</w:t>
+      </w:r>
+      <w:r>
+        <w:rPr>
+          <w:rFonts w:hint="eastAsia"/>
+          <w:szCs w:val="21"/>
+          <w:lang w:val="zh-CN"/>
+        </w:rPr>
+        <w:t>按照东软自由协议开发</w:t>
+      </w:r>
+      <w:r>
+        <w:rPr>
+          <w:szCs w:val="21"/>
+          <w:lang w:val="zh-CN"/>
+        </w:rPr>
+        <w:t>。</w:t>
       </w:r>
     </w:p>
     <w:p>
@@ -8004,6 +7980,9 @@
           <w:p>
             <w:pPr>
               <w:jc w:val="center"/>
+              <w:rPr>
+                <w:rFonts w:hint="eastAsia"/>
+              </w:rPr>
             </w:pPr>
             <w:r>
               <w:rPr>
@@ -8014,7 +7993,7 @@
                 <w:szCs w:val="18"/>
                 <w:lang w:val="zh-CN"/>
               </w:rPr>
-              <w:t>当前固定地址</w:t>
+              <w:t>地址</w:t>
             </w:r>
             <w:r>
               <w:rPr>
@@ -8025,18 +8004,7 @@
                 <w:szCs w:val="18"/>
                 <w:lang w:val="zh-CN"/>
               </w:rPr>
-              <w:t xml:space="preserve"> / </w:t>
-            </w:r>
-            <w:r>
-              <w:rPr>
-                <w:b/>
-                <w:bCs/>
-                <w:color w:val="FFFFFF"/>
-                <w:sz w:val="18"/>
-                <w:szCs w:val="18"/>
-                <w:lang w:val="zh-CN"/>
-              </w:rPr>
-              <w:t>说明</w:t>
+              <w:t xml:space="preserve"> </w:t>
             </w:r>
           </w:p>
         </w:tc>
@@ -8105,51 +8073,56 @@
           <w:p>
             <w:pPr>
               <w:jc w:val="left"/>
-            </w:pPr>
-            <w:r>
-              <w:rPr>
-                <w:color w:val="000000"/>
-                <w:sz w:val="18"/>
-                <w:szCs w:val="18"/>
-                <w:lang w:val="zh-CN"/>
-              </w:rPr>
-              <w:t>入口</w:t>
-            </w:r>
-            <w:r>
-              <w:rPr>
-                <w:color w:val="000000"/>
-                <w:sz w:val="18"/>
-                <w:szCs w:val="18"/>
-                <w:lang w:val="zh-CN"/>
-              </w:rPr>
-              <w:t xml:space="preserve"> 0x00020000</w:t>
-            </w:r>
-            <w:r>
-              <w:rPr>
-                <w:color w:val="000000"/>
-                <w:sz w:val="18"/>
-                <w:szCs w:val="18"/>
-                <w:lang w:val="zh-CN"/>
-              </w:rPr>
-              <w:t>；运行代码主要位于内部</w:t>
-            </w:r>
-            <w:r>
-              <w:rPr>
-                <w:color w:val="000000"/>
-                <w:sz w:val="18"/>
-                <w:szCs w:val="18"/>
-                <w:lang w:val="zh-CN"/>
-              </w:rPr>
-              <w:t xml:space="preserve"> RAM </w:t>
-            </w:r>
-            <w:r>
-              <w:rPr>
-                <w:color w:val="000000"/>
-                <w:sz w:val="18"/>
-                <w:szCs w:val="18"/>
-                <w:lang w:val="zh-CN"/>
-              </w:rPr>
-              <w:t>映射</w:t>
+              <w:rPr>
+                <w:rFonts w:hint="eastAsia"/>
+              </w:rPr>
+            </w:pPr>
+            <w:r>
+              <w:rPr>
+                <w:color w:val="000000"/>
+                <w:sz w:val="18"/>
+                <w:szCs w:val="18"/>
+                <w:lang w:val="zh-CN"/>
+              </w:rPr>
+              <w:t>0x00</w:t>
+            </w:r>
+            <w:r>
+              <w:rPr>
+                <w:rFonts w:hint="eastAsia"/>
+                <w:color w:val="000000"/>
+                <w:sz w:val="18"/>
+                <w:szCs w:val="18"/>
+                <w:lang w:val="zh-CN"/>
+              </w:rPr>
+              <w:t>0</w:t>
+            </w:r>
+            <w:r>
+              <w:rPr>
+                <w:color w:val="000000"/>
+                <w:sz w:val="18"/>
+                <w:szCs w:val="18"/>
+                <w:lang w:val="zh-CN"/>
+              </w:rPr>
+              <w:t>000</w:t>
+            </w:r>
+            <w:r>
+              <w:rPr>
+                <w:rFonts w:hint="eastAsia"/>
+                <w:color w:val="000000"/>
+                <w:sz w:val="18"/>
+                <w:szCs w:val="18"/>
+                <w:lang w:val="zh-CN"/>
+              </w:rPr>
+              <w:t xml:space="preserve"> - </w:t>
+            </w:r>
+            <w:r>
+              <w:rPr>
+                <w:color w:val="000000"/>
+                <w:sz w:val="18"/>
+                <w:szCs w:val="18"/>
+                <w:lang w:val="zh-CN"/>
+              </w:rPr>
+              <w:t>0x020000</w:t>
             </w:r>
           </w:p>
         </w:tc>
@@ -8196,7 +8169,7 @@
                 <w:szCs w:val="18"/>
                 <w:lang w:val="zh-CN"/>
               </w:rPr>
-              <w:t>Platform/Primary Bootloader</w:t>
+              <w:t>Platform Bootloader</w:t>
             </w:r>
             <w:r>
               <w:rPr>
@@ -8236,24 +8209,56 @@
           <w:p>
             <w:pPr>
               <w:jc w:val="left"/>
-            </w:pPr>
-            <w:r>
-              <w:rPr>
-                <w:color w:val="000000"/>
-                <w:sz w:val="18"/>
-                <w:szCs w:val="18"/>
-                <w:lang w:val="zh-CN"/>
-              </w:rPr>
-              <w:t>外部</w:t>
-            </w:r>
-            <w:r>
-              <w:rPr>
-                <w:color w:val="000000"/>
-                <w:sz w:val="18"/>
-                <w:szCs w:val="18"/>
-                <w:lang w:val="zh-CN"/>
-              </w:rPr>
-              <w:t xml:space="preserve"> Flash 0x020000</w:t>
+              <w:rPr>
+                <w:rFonts w:hint="eastAsia"/>
+              </w:rPr>
+            </w:pPr>
+            <w:r>
+              <w:rPr>
+                <w:color w:val="000000"/>
+                <w:sz w:val="18"/>
+                <w:szCs w:val="18"/>
+                <w:lang w:val="zh-CN"/>
+              </w:rPr>
+              <w:t>0x020000</w:t>
+            </w:r>
+            <w:r>
+              <w:rPr>
+                <w:rFonts w:hint="eastAsia"/>
+                <w:color w:val="000000"/>
+                <w:sz w:val="18"/>
+                <w:szCs w:val="18"/>
+                <w:lang w:val="zh-CN"/>
+              </w:rPr>
+              <w:t xml:space="preserve"> - </w:t>
+            </w:r>
+            <w:r>
+              <w:rPr>
+                <w:color w:val="000000"/>
+                <w:sz w:val="18"/>
+                <w:szCs w:val="18"/>
+                <w:lang w:val="zh-CN"/>
+              </w:rPr>
+              <w:t>0x0</w:t>
+            </w:r>
+            <w:r>
+              <w:rPr>
+                <w:rFonts w:hint="eastAsia"/>
+                <w:color w:val="000000"/>
+                <w:sz w:val="18"/>
+                <w:szCs w:val="18"/>
+                <w:lang w:val="zh-CN"/>
+              </w:rPr>
+              <w:t>5</w:t>
+            </w:r>
+            <w:r>
+              <w:rPr>
+                <w:color w:val="000000"/>
+                <w:sz w:val="18"/>
+                <w:szCs w:val="18"/>
+                <w:lang w:val="zh-CN"/>
+              </w:rPr>
+              <w:t>0000</w:t>
             </w:r>
           </w:p>
         </w:tc>
@@ -8279,7 +8284,7 @@
                 <w:szCs w:val="18"/>
                 <w:lang w:val="zh-CN"/>
               </w:rPr>
-              <w:t>FBL / custboot</w:t>
+              <w:t>ProductionApp</w:t>
             </w:r>
           </w:p>
         </w:tc>
@@ -8300,34 +8305,7 @@
                 <w:szCs w:val="18"/>
                 <w:lang w:val="zh-CN"/>
               </w:rPr>
-              <w:t>客户</w:t>
-            </w:r>
-            <w:r>
-              <w:rPr>
-                <w:color w:val="000000"/>
-                <w:sz w:val="18"/>
-                <w:szCs w:val="18"/>
-                <w:lang w:val="zh-CN"/>
-              </w:rPr>
-              <w:t>/</w:t>
-            </w:r>
-            <w:r>
-              <w:rPr>
-                <w:color w:val="000000"/>
-                <w:sz w:val="18"/>
-                <w:szCs w:val="18"/>
-                <w:lang w:val="zh-CN"/>
-              </w:rPr>
-              <w:t>功能</w:t>
-            </w:r>
-            <w:r>
-              <w:rPr>
-                <w:color w:val="000000"/>
-                <w:sz w:val="18"/>
-                <w:szCs w:val="18"/>
-                <w:lang w:val="zh-CN"/>
-              </w:rPr>
-              <w:t xml:space="preserve"> Bootloader</w:t>
+              <w:t>量产应用镜像</w:t>
             </w:r>
           </w:p>
         </w:tc>
@@ -8348,170 +8326,64 @@
                 <w:szCs w:val="18"/>
                 <w:lang w:val="zh-CN"/>
               </w:rPr>
-              <w:t>外部</w:t>
-            </w:r>
-            <w:r>
-              <w:rPr>
-                <w:color w:val="000000"/>
-                <w:sz w:val="18"/>
-                <w:szCs w:val="18"/>
-                <w:lang w:val="zh-CN"/>
-              </w:rPr>
-              <w:t xml:space="preserve"> Flash 0x050000</w:t>
-            </w:r>
-          </w:p>
-        </w:tc>
-      </w:tr>
-      <w:tr>
-        <w:trPr>
-          <w:cantSplit/>
-        </w:trPr>
-        <w:tc>
-          <w:tcPr>
-            <w:tcW w:w="1651" w:type="dxa"/>
-            <w:shd w:val="clear" w:color="auto" w:fill="F2F5F7"/>
-            <w:vAlign w:val="center"/>
-          </w:tcPr>
-          <w:p>
-            <w:pPr>
-              <w:jc w:val="left"/>
-            </w:pPr>
-            <w:r>
-              <w:rPr>
-                <w:color w:val="000000"/>
-                <w:sz w:val="18"/>
-                <w:szCs w:val="18"/>
-                <w:lang w:val="zh-CN"/>
-              </w:rPr>
-              <w:t>CustApp</w:t>
-            </w:r>
-          </w:p>
-        </w:tc>
-        <w:tc>
-          <w:tcPr>
-            <w:tcW w:w="3943" w:type="dxa"/>
-            <w:shd w:val="clear" w:color="auto" w:fill="F2F5F7"/>
-            <w:vAlign w:val="center"/>
-          </w:tcPr>
-          <w:p>
-            <w:pPr>
-              <w:jc w:val="left"/>
-            </w:pPr>
-            <w:r>
-              <w:rPr>
-                <w:color w:val="000000"/>
-                <w:sz w:val="18"/>
-                <w:szCs w:val="18"/>
-                <w:lang w:val="zh-CN"/>
-              </w:rPr>
-              <w:t>客户应用镜像</w:t>
-            </w:r>
-          </w:p>
-        </w:tc>
-        <w:tc>
-          <w:tcPr>
-            <w:tcW w:w="3576" w:type="dxa"/>
-            <w:shd w:val="clear" w:color="auto" w:fill="F2F5F7"/>
-            <w:vAlign w:val="center"/>
-          </w:tcPr>
-          <w:p>
-            <w:pPr>
-              <w:jc w:val="left"/>
-            </w:pPr>
-            <w:r>
-              <w:rPr>
-                <w:color w:val="000000"/>
-                <w:sz w:val="18"/>
-                <w:szCs w:val="18"/>
-                <w:lang w:val="zh-CN"/>
-              </w:rPr>
-              <w:t>外部</w:t>
-            </w:r>
-            <w:r>
-              <w:rPr>
-                <w:color w:val="000000"/>
-                <w:sz w:val="18"/>
-                <w:szCs w:val="18"/>
-                <w:lang w:val="zh-CN"/>
-              </w:rPr>
-              <w:t xml:space="preserve"> Flash 0x090000</w:t>
-            </w:r>
-          </w:p>
-        </w:tc>
-      </w:tr>
-      <w:tr>
-        <w:trPr>
-          <w:cantSplit/>
-        </w:trPr>
-        <w:tc>
-          <w:tcPr>
-            <w:tcW w:w="1651" w:type="dxa"/>
-            <w:shd w:val="clear" w:color="auto" w:fill="FFFFFF"/>
-            <w:vAlign w:val="center"/>
-          </w:tcPr>
-          <w:p>
-            <w:pPr>
-              <w:jc w:val="left"/>
-            </w:pPr>
-            <w:r>
-              <w:rPr>
-                <w:color w:val="000000"/>
-                <w:sz w:val="18"/>
-                <w:szCs w:val="18"/>
-                <w:lang w:val="zh-CN"/>
-              </w:rPr>
-              <w:t>ProductionApp</w:t>
-            </w:r>
-          </w:p>
-        </w:tc>
-        <w:tc>
-          <w:tcPr>
-            <w:tcW w:w="3943" w:type="dxa"/>
-            <w:shd w:val="clear" w:color="auto" w:fill="FFFFFF"/>
-            <w:vAlign w:val="center"/>
-          </w:tcPr>
-          <w:p>
-            <w:pPr>
-              <w:jc w:val="left"/>
-            </w:pPr>
-            <w:r>
-              <w:rPr>
-                <w:color w:val="000000"/>
-                <w:sz w:val="18"/>
-                <w:szCs w:val="18"/>
-                <w:lang w:val="zh-CN"/>
-              </w:rPr>
-              <w:t>量产应用镜像</w:t>
-            </w:r>
-          </w:p>
-        </w:tc>
-        <w:tc>
-          <w:tcPr>
-            <w:tcW w:w="3576" w:type="dxa"/>
-            <w:shd w:val="clear" w:color="auto" w:fill="FFFFFF"/>
-            <w:vAlign w:val="center"/>
-          </w:tcPr>
-          <w:p>
-            <w:pPr>
-              <w:jc w:val="left"/>
-            </w:pPr>
-            <w:r>
-              <w:rPr>
-                <w:color w:val="000000"/>
-                <w:sz w:val="18"/>
-                <w:szCs w:val="18"/>
-                <w:lang w:val="zh-CN"/>
-              </w:rPr>
-              <w:t>外部</w:t>
-            </w:r>
-            <w:r>
-              <w:rPr>
-                <w:color w:val="000000"/>
-                <w:sz w:val="18"/>
-                <w:szCs w:val="18"/>
-                <w:lang w:val="zh-CN"/>
-              </w:rPr>
-              <w:t xml:space="preserve"> Flash 0x190000</w:t>
+              <w:t>0x0</w:t>
+            </w:r>
+            <w:r>
+              <w:rPr>
+                <w:rFonts w:hint="eastAsia"/>
+                <w:color w:val="000000"/>
+                <w:sz w:val="18"/>
+                <w:szCs w:val="18"/>
+                <w:lang w:val="zh-CN"/>
+              </w:rPr>
+              <w:t>9</w:t>
+            </w:r>
+            <w:r>
+              <w:rPr>
+                <w:color w:val="000000"/>
+                <w:sz w:val="18"/>
+                <w:szCs w:val="18"/>
+                <w:lang w:val="zh-CN"/>
+              </w:rPr>
+              <w:t>0000</w:t>
+            </w:r>
+            <w:r>
+              <w:rPr>
+                <w:rFonts w:hint="eastAsia"/>
+                <w:color w:val="000000"/>
+                <w:sz w:val="18"/>
+                <w:szCs w:val="18"/>
+                <w:lang w:val="zh-CN"/>
+              </w:rPr>
+              <w:t xml:space="preserve"> - </w:t>
+            </w:r>
+            <w:r>
+              <w:rPr>
+                <w:color w:val="000000"/>
+                <w:sz w:val="18"/>
+                <w:szCs w:val="18"/>
+                <w:lang w:val="zh-CN"/>
+              </w:rPr>
+              <w:t>0x</w:t>
+            </w:r>
+            <w:r>
+              <w:rPr>
+                <w:rFonts w:hint="eastAsia"/>
+                <w:color w:val="000000"/>
+                <w:sz w:val="18"/>
+                <w:szCs w:val="18"/>
+                <w:lang w:val="zh-CN"/>
+              </w:rPr>
+              <w:t>19</w:t>
+            </w:r>
+            <w:r>
+              <w:rPr>
+                <w:color w:val="000000"/>
+                <w:sz w:val="18"/>
+                <w:szCs w:val="18"/>
+                <w:lang w:val="zh-CN"/>
+              </w:rPr>
+              <w:t>0000</w:t>
             </w:r>
           </w:p>
         </w:tc>
@@ -21919,7 +21791,7 @@
               <v:shape id="_x0000_i1025" type="#_x0000_t75" style="width:103.3pt;height:30.7pt">
                 <v:imagedata r:id="rId1" o:title=""/>
               </v:shape>
-              <o:OLEObject Type="Embed" ProgID="Visio.Drawing.11" ShapeID="_x0000_i1025" DrawAspect="Content" ObjectID="_1846062755" r:id="rId2"/>
+              <o:OLEObject Type="Embed" ProgID="Visio.Drawing.11" ShapeID="_x0000_i1025" DrawAspect="Content" ObjectID="_1846065279" r:id="rId2"/>
             </w:object>
           </w:r>
         </w:p>

</xml_diff>